<commit_message>
Reading homework: consistent readings/link format across weeks
Week 1 restructured to match Weeks 2-3: a "The readings" citation line
(McFeetors, full proxy URL as the link) + a "Your journal entry"
heading, replacing the inline "Open the article ->". Week 2 links
switched from "Open ->" to the full URL as visible linked text.

Co-Authored-By: Claude Opus 4.8 (1M context) <noreply@anthropic.com>
</commit_message>
<xml_diff>
--- a/week-1-reasoning-puzzles/week-1-reading-homework.docx
+++ b/week-1-reasoning-puzzles/week-1-reading-homework.docx
@@ -46,6 +46,28 @@
         </w:rPr>
         <w:t>Read McFeetors after Tuesday, then write one dated journal entry in Marginalia with both parts below. Don't just give answers — explain your reasoning; that's what counts.</w:t>
       </w:r>
+    </w:p>
+    <w:p>
+      <w:pPr>
+        <w:spacing w:after="120"/>
+      </w:pPr>
+      <w:r>
+        <w:rPr>
+          <w:rFonts w:ascii="Inter" w:hAnsi="Inter"/>
+          <w:b/>
+          <w:color w:val="1F4E96"/>
+          <w:sz w:val="24"/>
+        </w:rPr>
+        <w:t>The readings</w:t>
+      </w:r>
+    </w:p>
+    <w:p>
+      <w:r>
+        <w:rPr>
+          <w:rFonts w:ascii="Inter" w:hAnsi="Inter"/>
+        </w:rPr>
+        <w:t xml:space="preserve">McFeetors, P. J., &amp; Palfy, K. (2017). We're in Math Class Playing Games, Not Playing Games in Math Class. Mathematics Teaching in the Middle School, 22(9), 534–544. </w:t>
+      </w:r>
       <w:hyperlink r:id="rId12">
         <w:r>
           <w:rPr>
@@ -53,9 +75,23 @@
             <w:color w:val="2563EB"/>
             <w:u w:val="single"/>
           </w:rPr>
-          <w:t xml:space="preserve">  Open the article →</w:t>
+          <w:t>https://doi-org.proxy.lib.miamioh.edu/10.5951/mathteacmiddscho.22.9.0534</w:t>
         </w:r>
       </w:hyperlink>
+    </w:p>
+    <w:p>
+      <w:pPr>
+        <w:spacing w:after="120"/>
+      </w:pPr>
+      <w:r>
+        <w:rPr>
+          <w:rFonts w:ascii="Inter" w:hAnsi="Inter"/>
+          <w:b/>
+          <w:color w:val="1F4E96"/>
+          <w:sz w:val="24"/>
+        </w:rPr>
+        <w:t>Your journal entry</w:t>
+      </w:r>
     </w:p>
     <w:p>
       <w:pPr>

</xml_diff>

<commit_message>
Reframe Act I reading-journal prompts to concept anchors (wk1-5)
Replace the task-specific weekly prompts with durable, concept-anchored
questions grounded in the week's reading + Tuesday: Engagement (wk1),
Listening & student talk (wk2), Meeting learners where they are (wk3),
Rigor & justification (wk4), Assessment for learning (wk5). Removes the
Week 1 board image (concept prompt needs no visual) and collapses the
multi-part wk4/wk5 prompts to one question. Matches Journaler's baked-in
prompts word-for-word; anti-cram closing lines preserved.

Co-Authored-By: Claude Opus 4.8 (1M context) <noreply@anthropic.com>
</commit_message>
<xml_diff>
--- a/week-1-reasoning-puzzles/week-1-reading-homework.docx
+++ b/week-1-reasoning-puzzles/week-1-reading-homework.docx
@@ -101,19 +101,14 @@
         <w:rPr>
           <w:rFonts w:ascii="Inter" w:hAnsi="Inter"/>
           <w:b/>
-          <w:color w:val="1F4E96"/>
-          <w:sz w:val="24"/>
         </w:rPr>
-        <w:t>1 · Rank the opening moves</w:t>
+        <w:t>Engagement.</w:t>
       </w:r>
-    </w:p>
-    <w:p>
       <w:r>
         <w:rPr>
           <w:rFonts w:ascii="Inter" w:hAnsi="Inter"/>
-          <w:i w:val="0"/>
         </w:rPr>
-        <w:t>Below are three possible first moves in the same Metadoku board (shown in no particular order). Rank each move great, okay, or poor, and explain your ranking: what makes a strong first move here? There is no single right order — just explain your reasoning.</w:t>
+        <w:t xml:space="preserve"> How do games engage students in mathematics — and what instructional aims do we have to protect when we use them? Where does the mathematical thinking live in a game, and where can a game drift into play that isn't doing mathematical work? Draw on McFeetors and Palfy, and on what you noticed playing Tuesday, as your evidence.</w:t>
       </w:r>
     </w:p>
     <w:tbl>
@@ -318,30 +313,6 @@
         </w:tc>
       </w:tr>
     </w:tbl>
-    <w:p/>
-    <w:p>
-      <w:pPr>
-        <w:spacing w:after="120"/>
-      </w:pPr>
-      <w:r>
-        <w:rPr>
-          <w:rFonts w:ascii="Inter" w:hAnsi="Inter"/>
-          <w:b/>
-          <w:color w:val="1F4E96"/>
-          <w:sz w:val="24"/>
-        </w:rPr>
-        <w:t>2 · Then think about structure</w:t>
-      </w:r>
-    </w:p>
-    <w:p>
-      <w:r>
-        <w:rPr>
-          <w:rFonts w:ascii="Inter" w:hAnsi="Inter"/>
-          <w:i w:val="0"/>
-        </w:rPr>
-        <w:t>McFeetors studied two-player competitive games; Metadoku is solitaire — you play it alone. Could Metadoku (or Metaplete or Metagons) be played competitively, against an opponent? What would be gained, and what would be lost?</w:t>
-      </w:r>
-    </w:p>
     <w:p>
       <w:r>
         <w:rPr>

</xml_diff>